<commit_message>
test(repo): commit the post-acceptance re-measure captures (tables fixtures + scorecard)
What changed: 52 refreshed table-task fixtures (wc-tb-*/ir-tb-*) and the
scorecard capture from the re-measure run after the Tables fix loop's final
acceptance (e7fd383) — left uncommitted by that session.

Why: preserve the measured state before switching the working tree to the
ensure-parity verification branch.
</commit_message>
<xml_diff>
--- a/parity/fixtures/ir-tb-autofit-contents.docx
+++ b/parity/fixtures/ir-tb-autofit-contents.docx
@@ -22,19 +22,19 @@
       <w:tr>
         <w:tc>
           <w:tcPr>
-            <w:tcW w:w="222" w:type="auto"/>
+            <w:tcW w:w="0" w:type="auto"/>
           </w:tcPr>
           <w:p/>
         </w:tc>
         <w:tc>
           <w:tcPr>
-            <w:tcW w:w="222" w:type="auto"/>
+            <w:tcW w:w="0" w:type="auto"/>
           </w:tcPr>
           <w:p/>
         </w:tc>
         <w:tc>
           <w:tcPr>
-            <w:tcW w:w="222" w:type="auto"/>
+            <w:tcW w:w="0" w:type="auto"/>
           </w:tcPr>
           <w:p/>
         </w:tc>
@@ -42,19 +42,19 @@
       <w:tr>
         <w:tc>
           <w:tcPr>
-            <w:tcW w:w="222" w:type="auto"/>
+            <w:tcW w:w="0" w:type="auto"/>
           </w:tcPr>
           <w:p/>
         </w:tc>
         <w:tc>
           <w:tcPr>
-            <w:tcW w:w="222" w:type="auto"/>
+            <w:tcW w:w="0" w:type="auto"/>
           </w:tcPr>
           <w:p/>
         </w:tc>
         <w:tc>
           <w:tcPr>
-            <w:tcW w:w="222" w:type="auto"/>
+            <w:tcW w:w="0" w:type="auto"/>
           </w:tcPr>
           <w:p/>
         </w:tc>
@@ -62,19 +62,19 @@
       <w:tr>
         <w:tc>
           <w:tcPr>
-            <w:tcW w:w="222" w:type="auto"/>
+            <w:tcW w:w="0" w:type="auto"/>
           </w:tcPr>
           <w:p/>
         </w:tc>
         <w:tc>
           <w:tcPr>
-            <w:tcW w:w="222" w:type="auto"/>
+            <w:tcW w:w="0" w:type="auto"/>
           </w:tcPr>
           <w:p/>
         </w:tc>
         <w:tc>
           <w:tcPr>
-            <w:tcW w:w="222" w:type="auto"/>
+            <w:tcW w:w="0" w:type="auto"/>
           </w:tcPr>
           <w:p/>
         </w:tc>
@@ -1082,16 +1082,19 @@
     <w:basedOn w:val="TableNormal"/>
     <w:uiPriority w:val="49"/>
     <w:rsid w:val="005B78FB"/>
+    <w:pPr>
+      <w:spacing w:after="0" w:line="240" w:lineRule="auto"/>
+    </w:pPr>
     <w:tblPr>
       <w:tblStyleRowBandSize w:val="1"/>
       <w:tblStyleColBandSize w:val="1"/>
       <w:tblBorders>
-        <w:top w:val="single" w:sz="4" w:space="0" w:color="8EAADB" w:themeColor="accent1" w:themeTint="99"/>
-        <w:left w:val="single" w:sz="4" w:space="0" w:color="8EAADB" w:themeColor="accent1" w:themeTint="99"/>
-        <w:bottom w:val="single" w:sz="4" w:space="0" w:color="8EAADB" w:themeColor="accent1" w:themeTint="99"/>
-        <w:right w:val="single" w:sz="4" w:space="0" w:color="8EAADB" w:themeColor="accent1" w:themeTint="99"/>
-        <w:insideH w:val="single" w:sz="4" w:space="0" w:color="8EAADB" w:themeColor="accent1" w:themeTint="99"/>
-        <w:insideV w:val="single" w:sz="4" w:space="0" w:color="8EAADB" w:themeColor="accent1" w:themeTint="99"/>
+        <w:top w:val="single" w:sz="4" w:space="0" w:color="45B0E1" w:themeColor="accent1" w:themeTint="99"/>
+        <w:left w:val="single" w:sz="4" w:space="0" w:color="45B0E1" w:themeColor="accent1" w:themeTint="99"/>
+        <w:bottom w:val="single" w:sz="4" w:space="0" w:color="45B0E1" w:themeColor="accent1" w:themeTint="99"/>
+        <w:right w:val="single" w:sz="4" w:space="0" w:color="45B0E1" w:themeColor="accent1" w:themeTint="99"/>
+        <w:insideH w:val="single" w:sz="4" w:space="0" w:color="45B0E1" w:themeColor="accent1" w:themeTint="99"/>
+        <w:insideV w:val="single" w:sz="4" w:space="0" w:color="45B0E1" w:themeColor="accent1" w:themeTint="99"/>
       </w:tblBorders>
     </w:tblPr>
     <w:tblStylePr w:type="firstRow">
@@ -1103,14 +1106,14 @@
       <w:tblPr/>
       <w:tcPr>
         <w:tcBorders>
-          <w:top w:val="single" w:sz="4" w:space="0" w:color="4472C4" w:themeColor="accent1"/>
-          <w:left w:val="single" w:sz="4" w:space="0" w:color="4472C4" w:themeColor="accent1"/>
-          <w:bottom w:val="single" w:sz="4" w:space="0" w:color="4472C4" w:themeColor="accent1"/>
-          <w:right w:val="single" w:sz="4" w:space="0" w:color="4472C4" w:themeColor="accent1"/>
+          <w:top w:val="single" w:sz="4" w:space="0" w:color="156082" w:themeColor="accent1"/>
+          <w:left w:val="single" w:sz="4" w:space="0" w:color="156082" w:themeColor="accent1"/>
+          <w:bottom w:val="single" w:sz="4" w:space="0" w:color="156082" w:themeColor="accent1"/>
+          <w:right w:val="single" w:sz="4" w:space="0" w:color="156082" w:themeColor="accent1"/>
           <w:insideH w:val="nil"/>
           <w:insideV w:val="nil"/>
         </w:tcBorders>
-        <w:shd w:val="clear" w:color="auto" w:fill="4472C4" w:themeFill="accent1"/>
+        <w:shd w:val="clear" w:color="auto" w:fill="156082" w:themeFill="accent1"/>
       </w:tcPr>
     </w:tblStylePr>
     <w:tblStylePr w:type="lastRow">
@@ -1121,7 +1124,7 @@
       <w:tblPr/>
       <w:tcPr>
         <w:tcBorders>
-          <w:top w:val="double" w:sz="4" w:space="0" w:color="4472C4" w:themeColor="accent1"/>
+          <w:top w:val="double" w:sz="4" w:space="0" w:color="156082" w:themeColor="accent1"/>
         </w:tcBorders>
       </w:tcPr>
     </w:tblStylePr>
@@ -1140,13 +1143,13 @@
     <w:tblStylePr w:type="band1Vert">
       <w:tblPr/>
       <w:tcPr>
-        <w:shd w:val="clear" w:color="auto" w:fill="D9E2F3" w:themeFill="accent1" w:themeFillTint="33"/>
+        <w:shd w:val="clear" w:color="auto" w:fill="C1E4F5" w:themeFill="accent1" w:themeFillTint="33"/>
       </w:tcPr>
     </w:tblStylePr>
     <w:tblStylePr w:type="band1Horz">
       <w:tblPr/>
       <w:tcPr>
-        <w:shd w:val="clear" w:color="auto" w:fill="D9E2F3" w:themeFill="accent1" w:themeFillTint="33"/>
+        <w:shd w:val="clear" w:color="auto" w:fill="C1E4F5" w:themeFill="accent1" w:themeFillTint="33"/>
       </w:tcPr>
     </w:tblStylePr>
   </w:style>

</xml_diff>